<commit_message>
EcoOrganiza: informe más corto (2 páginas)
Co-Authored-By: Claude Sonnet 5.5 <noreply@anthropic.com>
Claude-Session: https://claude.ai/code/session_012WV3i5CNskdg7dgJ6kwcHp
</commit_message>
<xml_diff>
--- a/docs/tareas/ecoorganiza-informe.docx
+++ b/docs/tareas/ecoorganiza-informe.docx
@@ -18,21 +18,11 @@
       </w:r>
     </w:p>
     <w:p>
-      <w:r>
-        <w:t>Supuestos del caso: todo lo producido se vende; costo variable unitario constante; sin IVA, impuestos, depreciación ni intereses; resultado = ingresos menos los costos informados.</w:t>
-      </w:r>
-    </w:p>
-    <w:p>
       <w:pPr>
         <w:pStyle w:val="Heading2"/>
       </w:pPr>
       <w:r>
         <w:t>1. Diagnóstico (12 puntos)</w:t>
-      </w:r>
-    </w:p>
-    <w:p>
-      <w:r>
-        <w:t>Cuatro problemas que muestra el caso, con su consecuencia y la función del proceso administrativo a la que pertenecen:</w:t>
       </w:r>
     </w:p>
     <w:tbl>
@@ -56,7 +46,7 @@
             <w:r>
               <w:rPr>
                 <w:b/>
-                <w:sz w:val="18"/>
+                <w:sz w:val="17"/>
               </w:rPr>
               <w:t>Problema</w:t>
             </w:r>
@@ -70,7 +60,7 @@
             <w:r>
               <w:rPr>
                 <w:b/>
-                <w:sz w:val="18"/>
+                <w:sz w:val="17"/>
               </w:rPr>
               <w:t>Consecuencia</w:t>
             </w:r>
@@ -84,7 +74,7 @@
             <w:r>
               <w:rPr>
                 <w:b/>
-                <w:sz w:val="18"/>
+                <w:sz w:val="17"/>
               </w:rPr>
               <w:t>Función</w:t>
             </w:r>
@@ -98,7 +88,7 @@
             <w:r>
               <w:rPr>
                 <w:b/>
-                <w:sz w:val="18"/>
+                <w:sz w:val="17"/>
               </w:rPr>
               <w:t>Fundamento</w:t>
             </w:r>
@@ -113,7 +103,7 @@
           <w:p>
             <w:r>
               <w:rPr>
-                <w:sz w:val="18"/>
+                <w:sz w:val="17"/>
               </w:rPr>
               <w:t>Compra materiales cuando se agotan</w:t>
             </w:r>
@@ -126,9 +116,9 @@
           <w:p>
             <w:r>
               <w:rPr>
-                <w:sz w:val="18"/>
+                <w:sz w:val="17"/>
               </w:rPr>
-              <w:t>Paros de producción y compras urgentes, a veces más caras; pedidos tarde</w:t>
+              <w:t>Paros y compras urgentes; pedidos tarde</w:t>
             </w:r>
           </w:p>
         </w:tc>
@@ -139,7 +129,7 @@
           <w:p>
             <w:r>
               <w:rPr>
-                <w:sz w:val="18"/>
+                <w:sz w:val="17"/>
               </w:rPr>
               <w:t>Planificación</w:t>
             </w:r>
@@ -152,9 +142,9 @@
           <w:p>
             <w:r>
               <w:rPr>
-                <w:sz w:val="18"/>
+                <w:sz w:val="17"/>
               </w:rPr>
-              <w:t>Sin presupuesto ni calendario de compras no se anticipa qué se necesita.</w:t>
+              <w:t>No se anticipa lo que se necesita.</w:t>
             </w:r>
           </w:p>
         </w:tc>
@@ -167,7 +157,7 @@
           <w:p>
             <w:r>
               <w:rPr>
-                <w:sz w:val="18"/>
+                <w:sz w:val="17"/>
               </w:rPr>
               <w:t>No define metas ni responsables</w:t>
             </w:r>
@@ -180,9 +170,9 @@
           <w:p>
             <w:r>
               <w:rPr>
-                <w:sz w:val="18"/>
+                <w:sz w:val="17"/>
               </w:rPr>
-              <w:t>Nadie responde por los resultados y no se sabe si el mes salió bien o mal</w:t>
+              <w:t>Nadie responde por los resultados</w:t>
             </w:r>
           </w:p>
         </w:tc>
@@ -193,7 +183,7 @@
           <w:p>
             <w:r>
               <w:rPr>
-                <w:sz w:val="18"/>
+                <w:sz w:val="17"/>
               </w:rPr>
               <w:t>Organización</w:t>
             </w:r>
@@ -206,9 +196,9 @@
           <w:p>
             <w:r>
               <w:rPr>
-                <w:sz w:val="18"/>
+                <w:sz w:val="17"/>
               </w:rPr>
-              <w:t>Organizar es asignar tareas y responsables para cumplir los objetivos.</w:t>
+              <w:t>Organizar es asignar tareas y responsables.</w:t>
             </w:r>
           </w:p>
         </w:tc>
@@ -221,7 +211,7 @@
           <w:p>
             <w:r>
               <w:rPr>
-                <w:sz w:val="18"/>
+                <w:sz w:val="17"/>
               </w:rPr>
               <w:t>Duplica tareas por instrucciones poco claras</w:t>
             </w:r>
@@ -234,9 +224,9 @@
           <w:p>
             <w:r>
               <w:rPr>
-                <w:sz w:val="18"/>
+                <w:sz w:val="17"/>
               </w:rPr>
-              <w:t>Horas perdidas, trabajo repetido y entregas atrasadas</w:t>
+              <w:t>Horas perdidas y atrasos</w:t>
             </w:r>
           </w:p>
         </w:tc>
@@ -247,7 +237,7 @@
           <w:p>
             <w:r>
               <w:rPr>
-                <w:sz w:val="18"/>
+                <w:sz w:val="17"/>
               </w:rPr>
               <w:t>Dirección</w:t>
             </w:r>
@@ -260,9 +250,9 @@
           <w:p>
             <w:r>
               <w:rPr>
-                <w:sz w:val="18"/>
+                <w:sz w:val="17"/>
               </w:rPr>
-              <w:t>Dirigir es comunicar con claridad y coordinar al personal.</w:t>
+              <w:t>Dirigir es comunicar y coordinar.</w:t>
             </w:r>
           </w:p>
         </w:tc>
@@ -275,9 +265,9 @@
           <w:p>
             <w:r>
               <w:rPr>
-                <w:sz w:val="18"/>
+                <w:sz w:val="17"/>
               </w:rPr>
-              <w:t>Revisa costos solo al cierre y no compara alternativas</w:t>
+              <w:t>Revisa costos solo al cierre; no compara alternativas</w:t>
             </w:r>
           </w:p>
         </w:tc>
@@ -288,9 +278,9 @@
           <w:p>
             <w:r>
               <w:rPr>
-                <w:sz w:val="18"/>
+                <w:sz w:val="17"/>
               </w:rPr>
-              <w:t>Descubre los errores tarde y decide sin cifras (por ejemplo este pedido)</w:t>
+              <w:t>Detecta los errores tarde y decide sin cifras</w:t>
             </w:r>
           </w:p>
         </w:tc>
@@ -301,7 +291,7 @@
           <w:p>
             <w:r>
               <w:rPr>
-                <w:sz w:val="18"/>
+                <w:sz w:val="17"/>
               </w:rPr>
               <w:t>Control</w:t>
             </w:r>
@@ -314,15 +304,14 @@
           <w:p>
             <w:r>
               <w:rPr>
-                <w:sz w:val="18"/>
+                <w:sz w:val="17"/>
               </w:rPr>
-              <w:t>Controlar es comparar lo real con lo planificado a tiempo para corregir.</w:t>
+              <w:t>Controlar es comparar lo real con lo planificado a tiempo.</w:t>
             </w:r>
           </w:p>
         </w:tc>
       </w:tr>
     </w:tbl>
-    <w:p/>
     <w:p>
       <w:pPr>
         <w:pStyle w:val="Heading2"/>
@@ -351,7 +340,7 @@
             <w:r>
               <w:rPr>
                 <w:b/>
-                <w:sz w:val="18"/>
+                <w:sz w:val="17"/>
               </w:rPr>
               <w:t>Concepto</w:t>
             </w:r>
@@ -365,7 +354,7 @@
             <w:r>
               <w:rPr>
                 <w:b/>
-                <w:sz w:val="18"/>
+                <w:sz w:val="17"/>
               </w:rPr>
               <w:t>Cálculo</w:t>
             </w:r>
@@ -379,7 +368,7 @@
             <w:r>
               <w:rPr>
                 <w:b/>
-                <w:sz w:val="18"/>
+                <w:sz w:val="17"/>
               </w:rPr>
               <w:t>Monto</w:t>
             </w:r>
@@ -394,7 +383,7 @@
           <w:p>
             <w:r>
               <w:rPr>
-                <w:sz w:val="18"/>
+                <w:sz w:val="17"/>
               </w:rPr>
               <w:t>Costo variable unitario</w:t>
             </w:r>
@@ -407,7 +396,7 @@
           <w:p>
             <w:r>
               <w:rPr>
-                <w:sz w:val="18"/>
+                <w:sz w:val="17"/>
               </w:rPr>
               <w:t>3.000 + 1.200 + 800 + 2.000</w:t>
             </w:r>
@@ -420,7 +409,7 @@
           <w:p>
             <w:r>
               <w:rPr>
-                <w:sz w:val="18"/>
+                <w:sz w:val="17"/>
               </w:rPr>
               <w:t>$7.000</w:t>
             </w:r>
@@ -435,7 +424,7 @@
           <w:p>
             <w:r>
               <w:rPr>
-                <w:sz w:val="18"/>
+                <w:sz w:val="17"/>
               </w:rPr>
               <w:t>Ingresos</w:t>
             </w:r>
@@ -448,7 +437,7 @@
           <w:p>
             <w:r>
               <w:rPr>
-                <w:sz w:val="18"/>
+                <w:sz w:val="17"/>
               </w:rPr>
               <w:t>600 × 12.000</w:t>
             </w:r>
@@ -461,7 +450,7 @@
           <w:p>
             <w:r>
               <w:rPr>
-                <w:sz w:val="18"/>
+                <w:sz w:val="17"/>
               </w:rPr>
               <w:t>$7.200.000</w:t>
             </w:r>
@@ -476,7 +465,7 @@
           <w:p>
             <w:r>
               <w:rPr>
-                <w:sz w:val="18"/>
+                <w:sz w:val="17"/>
               </w:rPr>
               <w:t>Costos variables</w:t>
             </w:r>
@@ -489,7 +478,7 @@
           <w:p>
             <w:r>
               <w:rPr>
-                <w:sz w:val="18"/>
+                <w:sz w:val="17"/>
               </w:rPr>
               <w:t>600 × 7.000</w:t>
             </w:r>
@@ -502,7 +491,7 @@
           <w:p>
             <w:r>
               <w:rPr>
-                <w:sz w:val="18"/>
+                <w:sz w:val="17"/>
               </w:rPr>
               <w:t>$4.200.000</w:t>
             </w:r>
@@ -517,7 +506,7 @@
           <w:p>
             <w:r>
               <w:rPr>
-                <w:sz w:val="18"/>
+                <w:sz w:val="17"/>
               </w:rPr>
               <w:t>Costos fijos</w:t>
             </w:r>
@@ -530,7 +519,7 @@
           <w:p>
             <w:r>
               <w:rPr>
-                <w:sz w:val="18"/>
+                <w:sz w:val="17"/>
               </w:rPr>
               <w:t>650.000 + 700.000 + 150.000 + 100.000 + 200.000</w:t>
             </w:r>
@@ -543,7 +532,7 @@
           <w:p>
             <w:r>
               <w:rPr>
-                <w:sz w:val="18"/>
+                <w:sz w:val="17"/>
               </w:rPr>
               <w:t>$1.800.000</w:t>
             </w:r>
@@ -559,7 +548,7 @@
             <w:r>
               <w:rPr>
                 <w:b/>
-                <w:sz w:val="18"/>
+                <w:sz w:val="17"/>
               </w:rPr>
               <w:t>Costos totales</w:t>
             </w:r>
@@ -573,7 +562,7 @@
             <w:r>
               <w:rPr>
                 <w:b/>
-                <w:sz w:val="18"/>
+                <w:sz w:val="17"/>
               </w:rPr>
               <w:t>4.200.000 + 1.800.000</w:t>
             </w:r>
@@ -587,7 +576,7 @@
             <w:r>
               <w:rPr>
                 <w:b/>
-                <w:sz w:val="18"/>
+                <w:sz w:val="17"/>
               </w:rPr>
               <w:t>$6.000.000</w:t>
             </w:r>
@@ -603,7 +592,7 @@
             <w:r>
               <w:rPr>
                 <w:b/>
-                <w:sz w:val="18"/>
+                <w:sz w:val="17"/>
               </w:rPr>
               <w:t>Resultado</w:t>
             </w:r>
@@ -617,7 +606,7 @@
             <w:r>
               <w:rPr>
                 <w:b/>
-                <w:sz w:val="18"/>
+                <w:sz w:val="17"/>
               </w:rPr>
               <w:t>7.200.000 − 6.000.000</w:t>
             </w:r>
@@ -631,7 +620,7 @@
             <w:r>
               <w:rPr>
                 <w:b/>
-                <w:sz w:val="18"/>
+                <w:sz w:val="17"/>
               </w:rPr>
               <w:t>$1.200.000</w:t>
             </w:r>
@@ -639,10 +628,9 @@
         </w:tc>
       </w:tr>
     </w:tbl>
-    <w:p/>
     <w:p>
       <w:r>
-        <w:t>Interpretación: en un mes normal EcoOrganiza gana $1.200.000. Usa 600 de sus 800 unidades de capacidad, así que tiene 200 unidades de capacidad ociosa. Cada unidad vendida aporta $5.000 de margen de contribución (12.000 − 7.000) y los costos fijos de $1.800.000 se cubren con 360 unidades (1.800.000 ÷ 5.000).</w:t>
+        <w:t>Interpretación: en un mes normal gana $1.200.000 y le sobran 200 unidades de capacidad (600 de 800).</w:t>
       </w:r>
     </w:p>
     <w:p>
@@ -651,11 +639,6 @@
       </w:pPr>
       <w:r>
         <w:t>3. Evaluación del pedido (24 puntos)</w:t>
-      </w:r>
-    </w:p>
-    <w:p>
-      <w:r>
-        <w:t>Unidades totales = 600 habituales + 250 especiales = 850. Capacidad habitual 800, por lo que el exceso de capacidad es 850 − 800 = 50 unidades (en A no hay exceso: 600 &lt; 800). En B la máquina sube la capacidad a 900; en C esas 50 unidades se compran.</w:t>
       </w:r>
     </w:p>
     <w:tbl>
@@ -679,7 +662,7 @@
             <w:r>
               <w:rPr>
                 <w:b/>
-                <w:sz w:val="18"/>
+                <w:sz w:val="17"/>
               </w:rPr>
               <w:t>Concepto</w:t>
             </w:r>
@@ -693,7 +676,7 @@
             <w:r>
               <w:rPr>
                 <w:b/>
-                <w:sz w:val="18"/>
+                <w:sz w:val="17"/>
               </w:rPr>
               <w:t>A: rechazar</w:t>
             </w:r>
@@ -707,7 +690,7 @@
             <w:r>
               <w:rPr>
                 <w:b/>
-                <w:sz w:val="18"/>
+                <w:sz w:val="17"/>
               </w:rPr>
               <w:t>B: arrendar</w:t>
             </w:r>
@@ -721,7 +704,7 @@
             <w:r>
               <w:rPr>
                 <w:b/>
-                <w:sz w:val="18"/>
+                <w:sz w:val="17"/>
               </w:rPr>
               <w:t>C: externalizar</w:t>
             </w:r>
@@ -736,9 +719,9 @@
           <w:p>
             <w:r>
               <w:rPr>
-                <w:sz w:val="18"/>
+                <w:sz w:val="17"/>
               </w:rPr>
-              <w:t>Unidades totales (habituales + especiales)</w:t>
+              <w:t>Unidades totales</w:t>
             </w:r>
           </w:p>
         </w:tc>
@@ -749,7 +732,7 @@
           <w:p>
             <w:r>
               <w:rPr>
-                <w:sz w:val="18"/>
+                <w:sz w:val="17"/>
               </w:rPr>
               <w:t>600</w:t>
             </w:r>
@@ -762,7 +745,7 @@
           <w:p>
             <w:r>
               <w:rPr>
-                <w:sz w:val="18"/>
+                <w:sz w:val="17"/>
               </w:rPr>
               <w:t>850</w:t>
             </w:r>
@@ -775,7 +758,7 @@
           <w:p>
             <w:r>
               <w:rPr>
-                <w:sz w:val="18"/>
+                <w:sz w:val="17"/>
               </w:rPr>
               <w:t>850</w:t>
             </w:r>
@@ -790,9 +773,9 @@
           <w:p>
             <w:r>
               <w:rPr>
-                <w:sz w:val="18"/>
+                <w:sz w:val="17"/>
               </w:rPr>
-              <w:t>Exceso sobre la capacidad habitual (800)</w:t>
+              <w:t>Exceso sobre capacidad habitual (800)</w:t>
             </w:r>
           </w:p>
         </w:tc>
@@ -803,7 +786,7 @@
           <w:p>
             <w:r>
               <w:rPr>
-                <w:sz w:val="18"/>
+                <w:sz w:val="17"/>
               </w:rPr>
               <w:t>0</w:t>
             </w:r>
@@ -816,7 +799,7 @@
           <w:p>
             <w:r>
               <w:rPr>
-                <w:sz w:val="18"/>
+                <w:sz w:val="17"/>
               </w:rPr>
               <w:t>50</w:t>
             </w:r>
@@ -829,7 +812,7 @@
           <w:p>
             <w:r>
               <w:rPr>
-                <w:sz w:val="18"/>
+                <w:sz w:val="17"/>
               </w:rPr>
               <w:t>50</w:t>
             </w:r>
@@ -844,9 +827,9 @@
           <w:p>
             <w:r>
               <w:rPr>
-                <w:sz w:val="18"/>
+                <w:sz w:val="17"/>
               </w:rPr>
-              <w:t>Unidades fabricadas internamente</w:t>
+              <w:t>Unidades internas</w:t>
             </w:r>
           </w:p>
         </w:tc>
@@ -857,7 +840,7 @@
           <w:p>
             <w:r>
               <w:rPr>
-                <w:sz w:val="18"/>
+                <w:sz w:val="17"/>
               </w:rPr>
               <w:t>600</w:t>
             </w:r>
@@ -870,7 +853,7 @@
           <w:p>
             <w:r>
               <w:rPr>
-                <w:sz w:val="18"/>
+                <w:sz w:val="17"/>
               </w:rPr>
               <w:t>850</w:t>
             </w:r>
@@ -883,7 +866,7 @@
           <w:p>
             <w:r>
               <w:rPr>
-                <w:sz w:val="18"/>
+                <w:sz w:val="17"/>
               </w:rPr>
               <w:t>800</w:t>
             </w:r>
@@ -898,7 +881,7 @@
           <w:p>
             <w:r>
               <w:rPr>
-                <w:sz w:val="18"/>
+                <w:sz w:val="17"/>
               </w:rPr>
               <w:t>Unidades externalizadas</w:t>
             </w:r>
@@ -911,7 +894,7 @@
           <w:p>
             <w:r>
               <w:rPr>
-                <w:sz w:val="18"/>
+                <w:sz w:val="17"/>
               </w:rPr>
               <w:t>0</w:t>
             </w:r>
@@ -924,7 +907,7 @@
           <w:p>
             <w:r>
               <w:rPr>
-                <w:sz w:val="18"/>
+                <w:sz w:val="17"/>
               </w:rPr>
               <w:t>0</w:t>
             </w:r>
@@ -937,7 +920,7 @@
           <w:p>
             <w:r>
               <w:rPr>
-                <w:sz w:val="18"/>
+                <w:sz w:val="17"/>
               </w:rPr>
               <w:t>50</w:t>
             </w:r>
@@ -952,9 +935,9 @@
           <w:p>
             <w:r>
               <w:rPr>
-                <w:sz w:val="18"/>
+                <w:sz w:val="17"/>
               </w:rPr>
-              <w:t>Ingresos ventas habituales (600 × 12.000)</w:t>
+              <w:t>Ingresos habituales (600 × 12.000)</w:t>
             </w:r>
           </w:p>
         </w:tc>
@@ -965,7 +948,7 @@
           <w:p>
             <w:r>
               <w:rPr>
-                <w:sz w:val="18"/>
+                <w:sz w:val="17"/>
               </w:rPr>
               <w:t>7.200.000</w:t>
             </w:r>
@@ -978,7 +961,7 @@
           <w:p>
             <w:r>
               <w:rPr>
-                <w:sz w:val="18"/>
+                <w:sz w:val="17"/>
               </w:rPr>
               <w:t>7.200.000</w:t>
             </w:r>
@@ -991,7 +974,7 @@
           <w:p>
             <w:r>
               <w:rPr>
-                <w:sz w:val="18"/>
+                <w:sz w:val="17"/>
               </w:rPr>
               <w:t>7.200.000</w:t>
             </w:r>
@@ -1006,9 +989,9 @@
           <w:p>
             <w:r>
               <w:rPr>
-                <w:sz w:val="18"/>
+                <w:sz w:val="17"/>
               </w:rPr>
-              <w:t>Ingresos pedido especial (250 × 10.000)</w:t>
+              <w:t>Ingresos pedido (250 × 10.000)</w:t>
             </w:r>
           </w:p>
         </w:tc>
@@ -1019,7 +1002,7 @@
           <w:p>
             <w:r>
               <w:rPr>
-                <w:sz w:val="18"/>
+                <w:sz w:val="17"/>
               </w:rPr>
               <w:t>0</w:t>
             </w:r>
@@ -1032,7 +1015,7 @@
           <w:p>
             <w:r>
               <w:rPr>
-                <w:sz w:val="18"/>
+                <w:sz w:val="17"/>
               </w:rPr>
               <w:t>2.500.000</w:t>
             </w:r>
@@ -1045,7 +1028,7 @@
           <w:p>
             <w:r>
               <w:rPr>
-                <w:sz w:val="18"/>
+                <w:sz w:val="17"/>
               </w:rPr>
               <w:t>2.500.000</w:t>
             </w:r>
@@ -1060,7 +1043,7 @@
           <w:p>
             <w:r>
               <w:rPr>
-                <w:sz w:val="18"/>
+                <w:sz w:val="17"/>
               </w:rPr>
               <w:t>Ingresos totales</w:t>
             </w:r>
@@ -1073,7 +1056,7 @@
           <w:p>
             <w:r>
               <w:rPr>
-                <w:sz w:val="18"/>
+                <w:sz w:val="17"/>
               </w:rPr>
               <w:t>7.200.000</w:t>
             </w:r>
@@ -1086,7 +1069,7 @@
           <w:p>
             <w:r>
               <w:rPr>
-                <w:sz w:val="18"/>
+                <w:sz w:val="17"/>
               </w:rPr>
               <w:t>9.700.000</w:t>
             </w:r>
@@ -1099,7 +1082,7 @@
           <w:p>
             <w:r>
               <w:rPr>
-                <w:sz w:val="18"/>
+                <w:sz w:val="17"/>
               </w:rPr>
               <w:t>9.700.000</w:t>
             </w:r>
@@ -1114,9 +1097,9 @@
           <w:p>
             <w:r>
               <w:rPr>
-                <w:sz w:val="18"/>
+                <w:sz w:val="17"/>
               </w:rPr>
-              <w:t>Costos internos (unidades internas × 7.000)</w:t>
+              <w:t>Costos internos (× 7.000)</w:t>
             </w:r>
           </w:p>
         </w:tc>
@@ -1127,7 +1110,7 @@
           <w:p>
             <w:r>
               <w:rPr>
-                <w:sz w:val="18"/>
+                <w:sz w:val="17"/>
               </w:rPr>
               <w:t>4.200.000</w:t>
             </w:r>
@@ -1140,7 +1123,7 @@
           <w:p>
             <w:r>
               <w:rPr>
-                <w:sz w:val="18"/>
+                <w:sz w:val="17"/>
               </w:rPr>
               <w:t>5.950.000</w:t>
             </w:r>
@@ -1153,7 +1136,7 @@
           <w:p>
             <w:r>
               <w:rPr>
-                <w:sz w:val="18"/>
+                <w:sz w:val="17"/>
               </w:rPr>
               <w:t>5.600.000</w:t>
             </w:r>
@@ -1168,7 +1151,7 @@
           <w:p>
             <w:r>
               <w:rPr>
-                <w:sz w:val="18"/>
+                <w:sz w:val="17"/>
               </w:rPr>
               <w:t>Costos externalizados (50 × 9.000)</w:t>
             </w:r>
@@ -1181,7 +1164,7 @@
           <w:p>
             <w:r>
               <w:rPr>
-                <w:sz w:val="18"/>
+                <w:sz w:val="17"/>
               </w:rPr>
               <w:t>0</w:t>
             </w:r>
@@ -1194,7 +1177,7 @@
           <w:p>
             <w:r>
               <w:rPr>
-                <w:sz w:val="18"/>
+                <w:sz w:val="17"/>
               </w:rPr>
               <w:t>0</w:t>
             </w:r>
@@ -1207,7 +1190,7 @@
           <w:p>
             <w:r>
               <w:rPr>
-                <w:sz w:val="18"/>
+                <w:sz w:val="17"/>
               </w:rPr>
               <w:t>450.000</w:t>
             </w:r>
@@ -1222,7 +1205,7 @@
           <w:p>
             <w:r>
               <w:rPr>
-                <w:sz w:val="18"/>
+                <w:sz w:val="17"/>
               </w:rPr>
               <w:t>Costos fijos</w:t>
             </w:r>
@@ -1235,7 +1218,7 @@
           <w:p>
             <w:r>
               <w:rPr>
-                <w:sz w:val="18"/>
+                <w:sz w:val="17"/>
               </w:rPr>
               <w:t>1.800.000</w:t>
             </w:r>
@@ -1248,7 +1231,7 @@
           <w:p>
             <w:r>
               <w:rPr>
-                <w:sz w:val="18"/>
+                <w:sz w:val="17"/>
               </w:rPr>
               <w:t>1.800.000</w:t>
             </w:r>
@@ -1261,7 +1244,7 @@
           <w:p>
             <w:r>
               <w:rPr>
-                <w:sz w:val="18"/>
+                <w:sz w:val="17"/>
               </w:rPr>
               <w:t>1.800.000</w:t>
             </w:r>
@@ -1276,9 +1259,9 @@
           <w:p>
             <w:r>
               <w:rPr>
-                <w:sz w:val="18"/>
+                <w:sz w:val="17"/>
               </w:rPr>
-              <w:t>Arriendo adicional de máquina</w:t>
+              <w:t>Arriendo adicional</w:t>
             </w:r>
           </w:p>
         </w:tc>
@@ -1289,7 +1272,7 @@
           <w:p>
             <w:r>
               <w:rPr>
-                <w:sz w:val="18"/>
+                <w:sz w:val="17"/>
               </w:rPr>
               <w:t>0</w:t>
             </w:r>
@@ -1302,7 +1285,7 @@
           <w:p>
             <w:r>
               <w:rPr>
-                <w:sz w:val="18"/>
+                <w:sz w:val="17"/>
               </w:rPr>
               <w:t>350.000</w:t>
             </w:r>
@@ -1315,7 +1298,7 @@
           <w:p>
             <w:r>
               <w:rPr>
-                <w:sz w:val="18"/>
+                <w:sz w:val="17"/>
               </w:rPr>
               <w:t>0</w:t>
             </w:r>
@@ -1331,7 +1314,7 @@
             <w:r>
               <w:rPr>
                 <w:b/>
-                <w:sz w:val="18"/>
+                <w:sz w:val="17"/>
               </w:rPr>
               <w:t>Costos totales</w:t>
             </w:r>
@@ -1345,7 +1328,7 @@
             <w:r>
               <w:rPr>
                 <w:b/>
-                <w:sz w:val="18"/>
+                <w:sz w:val="17"/>
               </w:rPr>
               <w:t>6.000.000</w:t>
             </w:r>
@@ -1359,7 +1342,7 @@
             <w:r>
               <w:rPr>
                 <w:b/>
-                <w:sz w:val="18"/>
+                <w:sz w:val="17"/>
               </w:rPr>
               <w:t>8.100.000</w:t>
             </w:r>
@@ -1373,7 +1356,7 @@
             <w:r>
               <w:rPr>
                 <w:b/>
-                <w:sz w:val="18"/>
+                <w:sz w:val="17"/>
               </w:rPr>
               <w:t>7.850.000</w:t>
             </w:r>
@@ -1389,7 +1372,7 @@
             <w:r>
               <w:rPr>
                 <w:b/>
-                <w:sz w:val="18"/>
+                <w:sz w:val="17"/>
               </w:rPr>
               <w:t>RESULTADO</w:t>
             </w:r>
@@ -1403,7 +1386,7 @@
             <w:r>
               <w:rPr>
                 <w:b/>
-                <w:sz w:val="18"/>
+                <w:sz w:val="17"/>
               </w:rPr>
               <w:t>1.200.000</w:t>
             </w:r>
@@ -1417,7 +1400,7 @@
             <w:r>
               <w:rPr>
                 <w:b/>
-                <w:sz w:val="18"/>
+                <w:sz w:val="17"/>
               </w:rPr>
               <w:t>1.600.000</w:t>
             </w:r>
@@ -1431,7 +1414,7 @@
             <w:r>
               <w:rPr>
                 <w:b/>
-                <w:sz w:val="18"/>
+                <w:sz w:val="17"/>
               </w:rPr>
               <w:t>1.850.000</w:t>
             </w:r>
@@ -1439,15 +1422,14 @@
         </w:tc>
       </w:tr>
     </w:tbl>
-    <w:p/>
     <w:p>
       <w:r>
-        <w:t>Diferencias: B−A = 1.600.000 − 1.200.000 = $400.000; C−A = 1.850.000 − 1.200.000 = $650.000; B−C = 1.600.000 − 1.850.000 = −$250.000 (C supera a B en $250.000).</w:t>
+        <w:t>B−A = $400.000 · C−A = $650.000 · B−C = −$250.000.</w:t>
       </w:r>
     </w:p>
     <w:p>
       <w:r>
-        <w:t>Por qué vender más no garantiza un mayor resultado: cada unidad extra solo ayuda si aporta más de lo que cuesta producirla y entregarla. El pedido se vende a $10.000 y cuesta $7.000 de costo variable, o sea aporta $3.000 por unidad (menos que los $5.000 de la venta habitual). Las primeras 200 unidades caben en la capacidad ociosa y aportan 200 × 3.000 = $600.000. Las últimas 50 exigen un costo extra: en B el arriendo de $350.000 supera lo que aportan (50 × 3.000 = $150.000), así que pierden $200.000 (por eso B−A es 600.000 + 150.000 − 350.000 = $400.000); en C cada unidad comprada deja solo $1.000 (10.000 − 9.000), 50 × 1.000 = $50.000 (por eso C−A es 600.000 + 50.000 = $650.000). Si el precio fuera menor o el costo del arriendo o del proveedor mayor, vender más podría dejar igual o menos resultado que rechazar el pedido.</w:t>
+        <w:t>Vender más no garantiza más resultado: el pedido aporta $3.000 por unidad (10.000 − 7.000). Las primeras 200 unidades usan capacidad ociosa y aportan $600.000. Las últimas 50 exigen un costo extra: en B el arriendo ($350.000) supera lo que aportan (50 × 3.000 = $150.000); en C cada unidad comprada deja solo $1.000 (10.000 − 9.000).</w:t>
       </w:r>
     </w:p>
     <w:p>
@@ -1478,7 +1460,7 @@
             <w:r>
               <w:rPr>
                 <w:b/>
-                <w:sz w:val="18"/>
+                <w:sz w:val="17"/>
               </w:rPr>
               <w:t>Situación</w:t>
             </w:r>
@@ -1492,7 +1474,7 @@
             <w:r>
               <w:rPr>
                 <w:b/>
-                <w:sz w:val="18"/>
+                <w:sz w:val="17"/>
               </w:rPr>
               <w:t>Enfoque</w:t>
             </w:r>
@@ -1506,7 +1488,7 @@
             <w:r>
               <w:rPr>
                 <w:b/>
-                <w:sz w:val="18"/>
+                <w:sz w:val="17"/>
               </w:rPr>
               <w:t>Justificación</w:t>
             </w:r>
@@ -1521,7 +1503,7 @@
           <w:p>
             <w:r>
               <w:rPr>
-                <w:sz w:val="18"/>
+                <w:sz w:val="17"/>
               </w:rPr>
               <w:t>Estados financieros para un banco</w:t>
             </w:r>
@@ -1534,7 +1516,7 @@
           <w:p>
             <w:r>
               <w:rPr>
-                <w:sz w:val="18"/>
+                <w:sz w:val="17"/>
               </w:rPr>
               <w:t>Financiera</w:t>
             </w:r>
@@ -1547,9 +1529,9 @@
           <w:p>
             <w:r>
               <w:rPr>
-                <w:sz w:val="18"/>
+                <w:sz w:val="17"/>
               </w:rPr>
-              <w:t>Informa a usuarios externos con estados normados sobre lo ya ocurrido.</w:t>
+              <w:t>Usuario externo, información histórica.</w:t>
             </w:r>
           </w:p>
         </w:tc>
@@ -1562,7 +1544,7 @@
           <w:p>
             <w:r>
               <w:rPr>
-                <w:sz w:val="18"/>
+                <w:sz w:val="17"/>
               </w:rPr>
               <w:t>Comparación arriendo / externalización</w:t>
             </w:r>
@@ -1575,7 +1557,7 @@
           <w:p>
             <w:r>
               <w:rPr>
-                <w:sz w:val="18"/>
+                <w:sz w:val="17"/>
               </w:rPr>
               <w:t>Administrativa</w:t>
             </w:r>
@@ -1588,9 +1570,9 @@
           <w:p>
             <w:r>
               <w:rPr>
-                <w:sz w:val="18"/>
+                <w:sz w:val="17"/>
               </w:rPr>
-              <w:t>Es información interna para elegir entre alternativas futuras.</w:t>
+              <w:t>Decisión interna entre alternativas.</w:t>
             </w:r>
           </w:p>
         </w:tc>
@@ -1603,7 +1585,7 @@
           <w:p>
             <w:r>
               <w:rPr>
-                <w:sz w:val="18"/>
+                <w:sz w:val="17"/>
               </w:rPr>
               <w:t>Resultado real del período</w:t>
             </w:r>
@@ -1616,7 +1598,7 @@
           <w:p>
             <w:r>
               <w:rPr>
-                <w:sz w:val="18"/>
+                <w:sz w:val="17"/>
               </w:rPr>
               <w:t>Financiera</w:t>
             </w:r>
@@ -1629,9 +1611,9 @@
           <w:p>
             <w:r>
               <w:rPr>
-                <w:sz w:val="18"/>
+                <w:sz w:val="17"/>
               </w:rPr>
-              <w:t>Es el resultado histórico (ingresos − costos reales) que se informa al cierre.</w:t>
+              <w:t>Resultado histórico que se informa al cierre.</w:t>
             </w:r>
           </w:p>
         </w:tc>
@@ -1644,7 +1626,7 @@
           <w:p>
             <w:r>
               <w:rPr>
-                <w:sz w:val="18"/>
+                <w:sz w:val="17"/>
               </w:rPr>
               <w:t>Presupuesto futuro</w:t>
             </w:r>
@@ -1657,7 +1639,7 @@
           <w:p>
             <w:r>
               <w:rPr>
-                <w:sz w:val="18"/>
+                <w:sz w:val="17"/>
               </w:rPr>
               <w:t>Administrativa</w:t>
             </w:r>
@@ -1670,9 +1652,9 @@
           <w:p>
             <w:r>
               <w:rPr>
-                <w:sz w:val="18"/>
+                <w:sz w:val="17"/>
               </w:rPr>
-              <w:t>Proyecta lo que se espera para planificar y controlar.</w:t>
+              <w:t>Proyecta para planificar y controlar.</w:t>
             </w:r>
           </w:p>
         </w:tc>
@@ -1685,7 +1667,7 @@
           <w:p>
             <w:r>
               <w:rPr>
-                <w:sz w:val="18"/>
+                <w:sz w:val="17"/>
               </w:rPr>
               <w:t>Costo unitario para decidir</w:t>
             </w:r>
@@ -1698,7 +1680,7 @@
           <w:p>
             <w:r>
               <w:rPr>
-                <w:sz w:val="18"/>
+                <w:sz w:val="17"/>
               </w:rPr>
               <w:t>Administrativa</w:t>
             </w:r>
@@ -1711,9 +1693,9 @@
           <w:p>
             <w:r>
               <w:rPr>
-                <w:sz w:val="18"/>
+                <w:sz w:val="17"/>
               </w:rPr>
-              <w:t>Sirve a la gerencia para fijar precios y aceptar o rechazar pedidos.</w:t>
+              <w:t>Ayuda a fijar precios y aceptar pedidos.</w:t>
             </w:r>
           </w:p>
         </w:tc>
@@ -1726,7 +1708,7 @@
           <w:p>
             <w:r>
               <w:rPr>
-                <w:sz w:val="18"/>
+                <w:sz w:val="17"/>
               </w:rPr>
               <w:t>Activos, pasivos y patrimonio para un inversionista</w:t>
             </w:r>
@@ -1739,7 +1721,7 @@
           <w:p>
             <w:r>
               <w:rPr>
-                <w:sz w:val="18"/>
+                <w:sz w:val="17"/>
               </w:rPr>
               <w:t>Financiera</w:t>
             </w:r>
@@ -1752,18 +1734,17 @@
           <w:p>
             <w:r>
               <w:rPr>
-                <w:sz w:val="18"/>
+                <w:sz w:val="17"/>
               </w:rPr>
-              <w:t>Muestra la situación patrimonial a un usuario externo.</w:t>
+              <w:t>Situación patrimonial para un usuario externo.</w:t>
             </w:r>
           </w:p>
         </w:tc>
       </w:tr>
     </w:tbl>
-    <w:p/>
     <w:p>
       <w:r>
-        <w:t>Cómo se complementan, con un ejemplo: la contabilidad administrativa proyecta para noviembre un resultado de $1.850.000 con la alternativa C. Al cerrar el mes, la contabilidad financiera informa el resultado real y el balance al banco. Si el real fue distinto de $1.850.000, Carolina compara ambos, descubre la causa (por ejemplo, un costo mayor al presupuestado) y mejora el presupuesto del mes siguiente.</w:t>
+        <w:t>Se complementan: el presupuesto proyecta $1.850.000 para noviembre (administrativa); al cierre, la financiera informa el resultado real y se compara con lo presupuestado para corregir.</w:t>
       </w:r>
     </w:p>
     <w:p>
@@ -1779,7 +1760,7 @@
         <w:pStyle w:val="ListBullet"/>
       </w:pPr>
       <w:r>
-        <w:t>Planificación. Objetivo medible: cerrar noviembre con un resultado de al menos $1.850.000, entregando 850 unidades (600 habituales + 250 especiales) a tiempo. Acción 1: aprobar la muestra del proveedor y definir un calendario de compras con stock mínimo antes de empezar a producir el pedido. Acción 2: programar la producción de 800 unidades internas (200 por semana). Recursos: $450.000 para comprar las 50 unidades, madera e insumos para 800 unidades, 2 trabajadores, el encargado de compras y una planilla de seguimiento.</w:t>
+        <w:t>Planificación. Objetivo: cerrar noviembre con al menos $1.850.000, entregando las 850 unidades a tiempo. Acciones: (1) aprobar la muestra del proveedor y armar un calendario de compras; (2) programar 800 unidades internas (200 por semana). Recursos: $450.000 para la compra, materiales, 2 trabajadores y una planilla de seguimiento.</w:t>
       </w:r>
     </w:p>
     <w:p>
@@ -1787,7 +1768,7 @@
         <w:pStyle w:val="ListBullet"/>
       </w:pPr>
       <w:r>
-        <w:t>Organización. Carolina: decide y aprueba el presupuesto, negocia con la distribuidora y el proveedor y revisa los indicadores. Encargado de compras: calendario de compras, órdenes al proveedor, recepción y revisión de la muestra y del lote, y control del stock. Trabajador 1: preparación y corte de la madera. Trabajador 2: terminación, envase y etiqueta. Cada tarea con un responsable y sin duplicarse.</w:t>
+        <w:t>Organización. Carolina: decide, negocia con la distribuidora y el proveedor y revisa indicadores. Encargado de compras: calendario, órdenes, revisión de la muestra y stock. Trabajador 1: preparación y corte. Trabajador 2: terminación, envase y etiqueta.</w:t>
       </w:r>
     </w:p>
     <w:p>
@@ -1795,7 +1776,7 @@
         <w:pStyle w:val="ListBullet"/>
       </w:pPr>
       <w:r>
-        <w:t>Dirección. Comunicación: instrucciones escritas con cantidad, fecha y responsable, y una reunión corta de 10 minutos cada lunes. Coordinación: un cronograma semanal visible para que compras tenga los materiales antes de que producción los necesite. Manejo de atrasos: aviso inmediato a Carolina, reasignación de horas y prioridad al pedido especial; si hay riesgo de entrega tarde, informar de inmediato a la distribuidora.</w:t>
+        <w:t>Dirección. Comunicación: instrucciones escritas con cantidad, fecha y responsable. Coordinación: cronograma semanal compartido. Atrasos: aviso inmediato a Carolina, reasignar horas, priorizar el pedido e informar a la distribuidora.</w:t>
       </w:r>
     </w:p>
     <w:p>
@@ -1803,12 +1784,12 @@
         <w:pStyle w:val="ListBullet"/>
       </w:pPr>
       <w:r>
-        <w:t>Control. Indicador 1: unidades producidas contra el plan (meta 200 por semana), semanal; si baja de la meta, reasignar horas o revisar la causa. Indicador 2: entregas a tiempo (meta 100 % de las 850 unidades antes de la fecha acordada), semanal; si hay desvío, activar el plan de atraso. Indicador 3: costo variable unitario real (meta $7.000 o menos), quincenal; si sube, revisar mermas y precios de compra.</w:t>
+        <w:t>Control. (1) Unidades producidas contra el plan, meta 200 por semana, semanal: si baja, reasignar horas. (2) Entregas a tiempo, meta 100 %, semanal: si hay desvío, activar el plan de atraso. (3) Costo variable unitario real, meta $7.000 o menos, quincenal: si sube, revisar mermas y precios.</w:t>
       </w:r>
     </w:p>
     <w:p>
       <w:r>
-        <w:t>Si rechazan el pedido: el plan se enfoca en la operación habitual. Objetivo: cerrar noviembre con $1.200.000 vendiendo 600 unidades; mismas acciones de compras y control, sin la compra al proveedor, y con los indicadores de entregas a tiempo y costo variable unitario.</w:t>
+        <w:t>Si rechazan el pedido: el objetivo es cerrar con $1.200.000 vendiendo 600 unidades, con las mismas acciones de compras y control, sin la compra al proveedor.</w:t>
       </w:r>
     </w:p>
     <w:p>
@@ -1839,17 +1820,17 @@
         <w:pStyle w:val="Heading2"/>
       </w:pPr>
       <w:r>
-        <w:t>Cierre individual (borrador para que lo escribas con tus palabras)</w:t>
+        <w:t>Cierre individual (borrador: escríbelo con tus palabras)</w:t>
       </w:r>
     </w:p>
     <w:p>
       <w:r>
-        <w:t>¿Qué información fue clave? El margen de contribución unitario del pedido ($3.000) y el costo de pasar la capacidad de 800 unidades (arriendo de $350.000 o compra a $9.000). ¿Cómo cambiaría la decisión si variara? Si el proveedor cobrara más de $10.000 por unidad, o si su muestra no cumple, C dejaría de convenir y la mejor opción sería B. Si la distribuidora pidiera solo 200 unidades, bastaría la capacidad ociosa: sin arriendo ni compra el resultado sería $1.800.000. Si el precio especial bajara de $7.000, el pedido daría pérdida.</w:t>
+        <w:t>Información clave: el margen de $3.000 por unidad del pedido y el costo de pasar las 800 unidades (arriendo $350.000 o compra a $9.000). Si el proveedor cobrara más de $10.000 por unidad o su muestra fallara, C dejaría de convenir y iría B.</w:t>
       </w:r>
     </w:p>
     <w:sectPr>
       <w:pgSz w:w="12240" w:h="15840"/>
-      <w:pgMar w:top="1020" w:right="1134" w:bottom="1020" w:left="1134" w:header="720" w:footer="720" w:gutter="0"/>
+      <w:pgMar w:top="850" w:right="1134" w:bottom="850" w:left="1134" w:header="720" w:footer="720" w:gutter="0"/>
       <w:cols w:space="720"/>
       <w:docGrid w:linePitch="360"/>
     </w:sectPr>
@@ -2222,7 +2203,7 @@
     <w:rsid w:val="00FC693F"/>
     <w:rPr>
       <w:rFonts w:ascii="Arial" w:hAnsi="Arial"/>
-      <w:sz w:val="21"/>
+      <w:sz w:val="20"/>
     </w:rPr>
   </w:style>
   <w:style w:type="paragraph" w:styleId="Header">

</xml_diff>